<commit_message>
Wire the copy export script to also emit Word (.docx).
Keep PDF and DOCX in sync from the Markdown source for Drive handoff.

Co-authored-by: Cursor <cursoragent@cursor.com>
</commit_message>
<xml_diff>
--- a/docs/listener-journey-copy.docx
+++ b/docs/listener-journey-copy.docx
@@ -66,7 +66,7 @@
         <w:t xml:space="preserve"> </w:t>
       </w:r>
       <w:r>
-        <w:t xml:space="preserve">Change the strings in this file. The live app still holds its own UI strings — treat this as the review / handoff source until we wire screens to a shared copy module.</w:t>
+        <w:t xml:space="preserve">Prefer the Word file on Google Drive (upload → Open with Google Docs). Source of truth in-repo: this Markdown. Live app strings are still separate until wired to a shared copy module.</w:t>
       </w:r>
       <w:r>
         <w:br/>
@@ -76,7 +76,7 @@
           <w:b/>
           <w:bCs/>
         </w:rPr>
-        <w:t xml:space="preserve">PDF:</w:t>
+        <w:t xml:space="preserve">Exports:</w:t>
       </w:r>
       <w:r>
         <w:t xml:space="preserve"> </w:t>
@@ -86,14 +86,14 @@
           <w:rPr>
             <w:rStyle w:val="VerbatimChar"/>
           </w:rPr>
-          <w:t xml:space="preserve">docs/listener-journey-copy.pdf</w:t>
+          <w:t xml:space="preserve">listener-journey-copy.docx</w:t>
         </w:r>
       </w:hyperlink>
       <w:r>
         <w:t xml:space="preserve"> </w:t>
       </w:r>
       <w:r>
-        <w:t xml:space="preserve">(also downloadable from</w:t>
+        <w:t xml:space="preserve">(Drive) ·</w:t>
       </w:r>
       <w:r>
         <w:t xml:space="preserve"> </w:t>
@@ -101,13 +101,13 @@
       <w:hyperlink r:id="rId10">
         <w:r>
           <w:rPr>
-            <w:rStyle w:val="Hyperlink"/>
+            <w:rStyle w:val="VerbatimChar"/>
           </w:rPr>
-          <w:t xml:space="preserve">/listener-journey-copy.pdf</w:t>
+          <w:t xml:space="preserve">listener-journey-copy.pdf</w:t>
         </w:r>
       </w:hyperlink>
       <w:r>
-        <w:t xml:space="preserve">). Re-export after edits:</w:t>
+        <w:t xml:space="preserve">. Re-export:</w:t>
       </w:r>
       <w:r>
         <w:t xml:space="preserve"> </w:t>

</xml_diff>